<commit_message>
docs: revise paper narrative — reframe MACC budget, clarify scope and contributions
- Reframe 287K MACC as "matching DS-CNN baseline for fair comparison" (not arbitrary limit)
- Section E: separate existing TENet design from our optimization contribution
- Related Work B: remove self-reference, keep neutral NAS literature review
- Section F: add grid search vs NAS justification (small space, tractable enumeration)
- System Overview: clarify scope excludes audio acquisition/VAD
- Feature Extraction: add parameter justification citing standard KWS practice
- Abstract: "optimizing" not "improving", add baseline context

Co-Authored-By: Claude Opus 4.6 (1M context) <noreply@anthropic.com>
</commit_message>
<xml_diff>
--- a/Optimizing Temporal Efficient Networks for Embedded Keyword Spotting on Microcontrollers.docx
+++ b/Optimizing Temporal Efficient Networks for Embedded Keyword Spotting on Microcontrollers.docx
@@ -30,7 +30,7 @@
           <w:rFonts w:ascii="Times New Roman" w:hAnsi="Times New Roman"/>
           <w:sz w:val="22"/>
         </w:rPr>
-        <w:t xml:space="preserve"> — Keyword spotting (KWS) is a key enabling technology for voice-driven interfaces in embedded and Internet-of-Things (IoT) devices. Deploying deep learning models for KWS directly on microcontrollers is challenging due to strict constraints in memory capacity, computational resources, and energy consumption. In this work, we investigate the optimization of a lightweight neural network architecture for embedded keyword spotting applications. Specifically, we focus on improving the Temporal Efficient Network (TENet) architecture through systematic architecture exploration and hyperparameter optimization. Five candidate architectures are evaluated under a fixed computational budget, and TENet is selected as the most efficient base model. A four-stage progressive grid search is then performed over six architectural hyperparameters, evaluating 2,302 candidate configurations. The optimized model is trained using the Google Speech Commands v2 dataset with data augmentation techniques including SpecAugment, Mixup, and label smoothing, and deployed on an STM32F767IGT6 microcontroller based on the ARM Cortex-M7 architecture. Experimental results show that the proposed model achieves a test accuracy of 96.84% (96.76% after INT8 quantization) and a weighted F1-score of 0.9675 with only 12,822 parameters and 276,136 multiply-accumulate operations (MACCs). The deployed INT8 model requires 13.87 KB of flash memory and 7.64 KB of RAM, and achieves an average inference latency of 6.32 ms on the target hardware. Compared with previously reported lightweight keyword spotting architectures operating under similar computational constraints, the optimized TENet model achieves improved classification performance while maintaining a compact footprint suitable for real-time embedded deployment.</w:t>
+        <w:t xml:space="preserve"> — Keyword spotting (KWS) is a key enabling technology for voice-driven interfaces in embedded and Internet-of-Things (IoT) devices. Deploying deep learning models for KWS directly on microcontrollers is challenging due to strict constraints in memory capacity, computational resources, and energy consumption. In this work, we investigate the optimization of a lightweight neural network architecture for embedded keyword spotting applications. Specifically, we focus on optimizing the Temporal Efficient Network (TENet) architecture through systematic architecture exploration and hyperparameter optimization. Five candidate architectures are evaluated under a computational budget matching a previously reported DS-CNN baseline to enable direct comparison, and TENet is selected as the most efficient base model. A four-stage progressive grid search is then performed over six architectural hyperparameters, evaluating 2,302 candidate configurations. The optimized model is trained using the Google Speech Commands v2 dataset with data augmentation techniques including SpecAugment, Mixup, and label smoothing, and deployed on an STM32F767IGT6 microcontroller based on the ARM Cortex-M7 architecture. Experimental results show that the proposed model achieves a test accuracy of 96.84% (96.76% after INT8 quantization) and a weighted F1-score of 0.9675 with only 12,822 parameters and 276,136 multiply-accumulate operations (MACCs). The deployed INT8 model requires 13.87 KB of flash memory and 7.64 KB of RAM, and achieves an average inference latency of 6.32 ms on the target hardware. Compared with previously reported lightweight keyword spotting architectures operating under similar computational constraints, the optimized TENet model achieves improved classification performance while maintaining a compact footprint suitable for real-time embedded deployment.</w:t>
       </w:r>
     </w:p>
     <w:p>
@@ -123,7 +123,7 @@
           <w:i w:val="0"/>
           <w:sz w:val="22"/>
         </w:rPr>
-        <w:t>Motivated by these challenges, this work investigates the optimization of a lightweight neural architecture for keyword spotting on embedded microcontrollers. Specifically, we focus on the Temporal Efficient Network (TENet) architecture [4] and perform systematic architecture exploration and hyperparameter optimization to improve its performance under a strict computational budget of 287,673 MACCs. The optimized model is trained on the Google Speech Commands v2 dataset [1] and deployed on an STM32F767IGT6 microcontroller based on the ARM Cortex-M7 architecture using the ST X-CUBE-AI framework [8].</w:t>
+        <w:t>Motivated by these challenges, this work investigates the optimization of a lightweight neural architecture for keyword spotting on embedded microcontrollers. Specifically, we focus on the Temporal Efficient Network (TENet) architecture [4] and perform systematic architecture exploration and hyperparameter optimization under a computational budget matching the DS-CNN baseline reported by Sorensen et al. [9], enabling direct comparison on the same MCU platform. The optimized model is trained on the Google Speech Commands v2 dataset [1] and deployed on an STM32F767IGT6 microcontroller based on the ARM Cortex-M7 architecture using the ST X-CUBE-AI framework [8].</w:t>
       </w:r>
     </w:p>
     <w:p>
@@ -146,7 +146,7 @@
           <w:rFonts w:ascii="Times New Roman" w:hAnsi="Times New Roman"/>
           <w:sz w:val="22"/>
         </w:rPr>
-        <w:t>Architecture evaluation for embedded keyword spotting: Five lightweight neural architectures (TENet, LiCoNet, DS-CNN, MobileNet-style, and BC-ResNet) are evaluated under a fixed MACC budget to identify the most efficient model for microcontroller deployment.</w:t>
+        <w:t>Architecture evaluation for embedded keyword spotting: Five lightweight neural architectures (TENet, LiCoNet, DS-CNN, MobileNet-style, and BC-ResNet) are evaluated under a common computational budget to identify the most efficient model for microcontroller deployment.</w:t>
       </w:r>
     </w:p>
     <w:p>
@@ -304,7 +304,7 @@
           <w:i w:val="0"/>
           <w:sz w:val="22"/>
         </w:rPr>
-        <w:t>For smaller search spaces with a limited number of discrete hyperparameters, grid search and random search remain practical alternatives. Bergstra and Bengio [14] showed that random search can be more efficient than grid search in high-dimensional spaces, while successive halving strategies [15] reduce computational cost by progressively eliminating poor candidates. The progressive grid search approach used in this work combines exhaustive enumeration with staged elimination, which is effective for the six-dimensional search space considered.</w:t>
+        <w:t>For smaller search spaces with a limited number of discrete hyperparameters, grid search and random search remain practical alternatives. Bergstra and Bengio [14] showed that random search can be more efficient than grid search in high-dimensional spaces, while successive halving strategies [15] reduce computational cost by progressively eliminating poor candidates.</w:t>
       </w:r>
     </w:p>
     <w:p>
@@ -370,7 +370,7 @@
           <w:i w:val="0"/>
           <w:sz w:val="22"/>
         </w:rPr>
-        <w:t>The proposed keyword spotting system follows a lightweight processing pipeline designed for deployment on resource-constrained microcontrollers. The system consists of three main stages: audio acquisition, feature extraction, and neural network inference.</w:t>
+        <w:t>The end-to-end keyword spotting pipeline consists of three stages: audio acquisition, feature extraction, and neural network inference. This work focuses on the latter two stages: feature extraction and classification. Audio data is sourced from the Google Speech Commands v2 dataset [1], which provides pre-segmented one-second utterances; real-time audio acquisition and voice activity detection are outside the scope of this work.</w:t>
       </w:r>
     </w:p>
     <w:p>
@@ -384,7 +384,7 @@
           <w:i w:val="0"/>
           <w:sz w:val="22"/>
         </w:rPr>
-        <w:t>Raw audio waveforms are captured at 16 kHz and segmented into one-second frames. The audio signal is then transformed into MFCC features, which provide a compact representation of the spectral characteristics of speech. These features are used as input to a lightweight neural network classifier that predicts the corresponding keyword class. The overall design minimizes computational complexity and memory usage to enable real-time inference on embedded hardware.</w:t>
+        <w:t>Each audio sample (16 kHz, one second) is transformed into MFCC features, which provide a compact representation of the spectral characteristics of speech. These features are used as input to a lightweight neural network classifier that predicts the corresponding keyword class. The overall design minimizes computational complexity and memory usage to enable real-time inference on embedded hardware.</w:t>
       </w:r>
     </w:p>
     <w:p>
@@ -799,7 +799,7 @@
           <w:i w:val="0"/>
           <w:sz w:val="22"/>
         </w:rPr>
-        <w:t>To convert raw audio signals into a representation suitable for neural network processing, Mel-Frequency Cepstral Coefficient (MFCC) features [7] are extracted from each audio sample using torchaudio.transforms.MFCC.</w:t>
+        <w:t>Mel-Frequency Cepstral Coefficient (MFCC) features [7] are extracted from each audio sample using torchaudio. Following standard practice in small-footprint KWS [2][9], 13 MFCC coefficients are used, which capture the dominant spectral envelope characteristics of speech while maintaining a compact input representation.</w:t>
       </w:r>
     </w:p>
     <w:tbl>
@@ -1186,7 +1186,7 @@
           <w:i w:val="0"/>
           <w:sz w:val="22"/>
         </w:rPr>
-        <w:t>These parameters produce an MFCC feature representation of 62 temporal frames × 13 coefficients per sample, resulting in an input tensor of shape (1, 62, 13) with a size of 3,224 bytes in float32 precision.</w:t>
+        <w:t>With a 512-sample window and 256-sample hop at 16 kHz, each one-second audio clip produces 62 temporal frames. Combined with 13 MFCC coefficients, this yields an input tensor of shape (1, 62, 13) with a size of 3,224 bytes in float32 precision. The number of mel filters (16) was chosen to balance spectral resolution with computational cost for the target MCU.</w:t>
       </w:r>
     </w:p>
     <w:p>
@@ -1208,7 +1208,7 @@
           <w:i w:val="0"/>
           <w:sz w:val="22"/>
         </w:rPr>
-        <w:t>To identify the most efficient architecture for the target computational budget, five lightweight neural network architectures were evaluated under a constraint of approximately 287K MACCs. All models were trained for 50 epochs with identical training settings (AdamW, lr=0.001, batch size=1024) on the 12-class task.</w:t>
+        <w:t>To identify the most efficient architecture under the target computational budget (matching the DS-CNN baseline [9]), five lightweight neural network architectures were evaluated. All models were configured to operate within approximately 287K MACCs and trained for 50 epochs with identical settings (AdamW, lr=0.001, batch size=1024) on the 12-class task.</w:t>
       </w:r>
     </w:p>
     <w:p>
@@ -1969,7 +1969,7 @@
           <w:i w:val="0"/>
           <w:sz w:val="22"/>
         </w:rPr>
-        <w:t>The TENet architecture [4] processes MFCC sequences using one-dimensional temporal convolutions. The input tensor (1, 62, 13) is reshaped to (13, 62), treating the 13 MFCC coefficients as input channels and the 62 frames as the temporal dimension.</w:t>
+        <w:t>Based on the architecture comparison in Section III.D, TENet [4] was selected as the base architecture for further optimization. TENet processes MFCC sequences using one-dimensional temporal convolutions. The input tensor (1, 62, 13) is reshaped to (13, 62), treating the 13 MFCC coefficients as input channels and the 62 frames as the temporal dimension.</w:t>
       </w:r>
     </w:p>
     <w:p>
@@ -1983,7 +1983,7 @@
           <w:i w:val="0"/>
           <w:sz w:val="22"/>
         </w:rPr>
-        <w:t>The architecture adopts an inverted bottleneck design inspired by MobileNetV2 [10], where each block consists of: (1) pointwise expansion Conv1d (in_ch → in_ch × ratio, kernel=1) to increase channel dimension; (2) depthwise temporal Conv1d (hidden, hidden, kernel=k, groups=hidden) for temporal feature extraction; (3) pointwise projection Conv1d (hidden → out_ch, kernel=1) for dimensionality reduction with no activation (linear); and (4) a residual connection (identity shortcut when stride=1 and in_ch=out_ch, otherwise a 1×1 projection shortcut).</w:t>
+        <w:t>The TENet block adopts the inverted bottleneck design from MobileNetV2 [10], adapted for 1D temporal processing. Each block consists of: (1) pointwise expansion Conv1d (in_ch → in_ch × ratio, kernel=1); (2) depthwise temporal Conv1d (groups=hidden, kernel=k); (3) pointwise projection Conv1d (hidden → out_ch, kernel=1) with linear activation; and (4) a residual connection. This is a standard building block; our contribution lies not in the block design but in the specific configuration discovered through systematic search (Section III.F).</w:t>
       </w:r>
     </w:p>
     <w:p>
@@ -2433,7 +2433,7 @@
           <w:i w:val="0"/>
           <w:sz w:val="22"/>
         </w:rPr>
-        <w:t>Three key architectural design choices distinguish this configuration:</w:t>
+        <w:t>Three key findings from the grid search distinguish the optimized configuration from typical TENet designs:</w:t>
       </w:r>
     </w:p>
     <w:p>
@@ -2541,7 +2541,7 @@
           <w:i w:val="0"/>
           <w:sz w:val="22"/>
         </w:rPr>
-        <w:t>After selecting TENet as the base architecture, a four-stage progressive grid search was conducted to identify improved architectural configurations within the MACC budget of 287,673 (matching the DS-CNN baseline [9]).</w:t>
+        <w:t>After selecting TENet as the base architecture, a four-stage progressive grid search was conducted to identify improved architectural configurations. The computational budget was set to match the DS-CNN baseline reported by Sorensen et al. [9] (287,673 MACCs), enabling direct comparison on the same MCU platform under identical resource constraints. The search space comprises six discrete architectural hyperparameters with fewer than 3,000 feasible configurations under the MACC constraint. For a space of this scale, exhaustive evaluation with progressive filtering is computationally tractable (~16 GPU-hours on a single GPU) and avoids the approximation errors inherent in weight-sharing NAS methods [12]. The progressive filtering strategy is conceptually related to successive halving [15].</w:t>
       </w:r>
     </w:p>
     <w:p>
@@ -3743,7 +3743,7 @@
           <w:i w:val="0"/>
           <w:sz w:val="22"/>
         </w:rPr>
-        <w:t>All experiments were conducted on an NVIDIA RTX 5080 Laptop GPU with data preloaded to GPU VRAM for efficient small-model training. The progressive search strategy is conceptually related to successive halving [15], where computational resources are concentrated on the most promising candidates in later stages.</w:t>
+        <w:t>All experiments were conducted on an NVIDIA RTX 5080 Laptop GPU with data preloaded to GPU VRAM for efficient small-model training.</w:t>
       </w:r>
     </w:p>
     <w:p>
@@ -10465,7 +10465,7 @@
           <w:i w:val="0"/>
           <w:sz w:val="22"/>
         </w:rPr>
-        <w:t>This paper presented an optimized keyword spotting system designed for deployment on resource-constrained microcontrollers. Through a five-architecture comparison study and a four-stage progressive grid search over 2,302 candidate configurations, an optimized TENet variant was identified that achieves high classification accuracy within a strict computational budget of 276K MACCs.</w:t>
+        <w:t>This paper presented an optimized keyword spotting system designed for deployment on resource-constrained microcontrollers. Through a five-architecture comparison study and a four-stage progressive grid search over 2,302 candidate configurations, an optimized TENet variant was identified that achieves high classification accuracy within a computational budget of 276K MACCs.</w:t>
       </w:r>
     </w:p>
     <w:p>

</xml_diff>

<commit_message>
docs: fix consistency issues — figure numbering, MACs→MACCs, float32
- Renumber Fig 4↔5 to match document order (training curve=4, per-class=5)
- Fix "MACs" → "MACCs" in Related Work (BC-ResNet paragraph)
- Standardize float32 in figure caption

Co-Authored-By: Claude Opus 4.6 (1M context) <noreply@anthropic.com>
</commit_message>
<xml_diff>
--- a/Optimizing Temporal Efficient Networks for Embedded Keyword Spotting on Microcontrollers.docx
+++ b/Optimizing Temporal Efficient Networks for Embedded Keyword Spotting on Microcontrollers.docx
@@ -254,7 +254,7 @@
           <w:i w:val="0"/>
           <w:sz w:val="22"/>
         </w:rPr>
-        <w:t>Kim et al. [5] proposed BC-ResNet, which uses broadcasted residual connections and sub-spectral normalization to achieve state-of-the-art accuracy (up to 98.7% with BC-ResNet-8) on the same benchmark. However, even the smallest variant (BC-ResNet-1, 9.2K parameters) requires 3.1M MACs, which exceeds the computational budget considered in this work.</w:t>
+        <w:t>Kim et al. [5] proposed BC-ResNet, which uses broadcasted residual connections and sub-spectral normalization to achieve state-of-the-art accuracy (up to 98.7% with BC-ResNet-8) on the same benchmark. However, even the smallest variant (BC-ResNet-1, 9.2K parameters) requires 3.1M MACCs, which exceeds the computational budget considered in this work.</w:t>
       </w:r>
     </w:p>
     <w:p>
@@ -4388,7 +4388,7 @@
           <w:rFonts w:ascii="Times New Roman" w:hAnsi="Times New Roman"/>
           <w:sz w:val="20"/>
         </w:rPr>
-        <w:t>Fig. 5. Training curve showing validation accuracy and cosine annealing learning rate schedule over 273 epochs.</w:t>
+        <w:t>Fig. 4. Training curve showing validation accuracy and cosine annealing learning rate schedule over 273 epochs.</w:t>
       </w:r>
     </w:p>
     <w:p>
@@ -5799,7 +5799,7 @@
           <w:rFonts w:ascii="Times New Roman" w:hAnsi="Times New Roman"/>
           <w:sz w:val="20"/>
         </w:rPr>
-        <w:t>Fig. 4. Per-class F1-scores comparing Float32 and INT8 models across all 12 classes.</w:t>
+        <w:t>Fig. 5. Per-class F1-scores comparing float32 and INT8 models across all 12 classes.</w:t>
       </w:r>
     </w:p>
     <w:p>

</xml_diff>

<commit_message>
docs: fix 4 wrong references, add LiCoNet [22]
- [4] TENet: R. Li et al → X. Li, X. Wei, X. Qin (verified via ISCA Archive)
- [13] MicroNAS: S. Liberatore et al → Y. Qiao, H. Xu, Y. Zhang, S. Huang (DATE 2024)
- [16] CMSIS-NN: fix title "neural networks" → "neural network kernels"
- [21] Bartoli et al: fix all 3 author names (verified via arXiv:2509.07051)
- Add [22] H. Yang et al., LiCo-Net (arXiv:2211.04635) — was cited without ref

Co-Authored-By: Claude Opus 4.6 (1M context) <noreply@anthropic.com>
</commit_message>
<xml_diff>
--- a/Optimizing Temporal Efficient Networks for Embedded Keyword Spotting on Microcontrollers.docx
+++ b/Optimizing Temporal Efficient Networks for Embedded Keyword Spotting on Microcontrollers.docx
@@ -268,7 +268,7 @@
           <w:i w:val="0"/>
           <w:sz w:val="22"/>
         </w:rPr>
-        <w:t>Majumdar and Ginsburg [6] developed MatchboxNet using 1D time-channel separable convolutions, achieving 97.48% accuracy with 93K parameters. LiCoNet uses linearized convolutions for efficient streaming inference on embedded platforms.</w:t>
+        <w:t>Majumdar and Ginsburg [6] developed MatchboxNet using 1D time-channel separable convolutions, achieving 97.48% accuracy with 93K parameters. Yang et al. [22] proposed LiCoNet, which uses linearized convolutions for efficient streaming inference on embedded platforms.</w:t>
       </w:r>
     </w:p>
     <w:p>
@@ -10565,7 +10565,7 @@
           <w:rFonts w:ascii="Times New Roman" w:hAnsi="Times New Roman"/>
           <w:sz w:val="20"/>
         </w:rPr>
-        <w:t>[4] R. Li, Z. Gao, L. Wang, and G. Li, "Small-footprint keyword spotting with multi-scale temporal convolution," in Proc. Interspeech, 2020.</w:t>
+        <w:t>[4] X. Li, X. Wei, and X. Qin, "Small-footprint keyword spotting with multi-scale temporal convolution," in Proc. Interspeech, 2020, pp. 1987–1991.</w:t>
       </w:r>
     </w:p>
     <w:p>
@@ -10646,7 +10646,7 @@
           <w:rFonts w:ascii="Times New Roman" w:hAnsi="Times New Roman"/>
           <w:sz w:val="20"/>
         </w:rPr>
-        <w:t>[13] S. Liberatore, F. Pollicino, and M. Rusci, "MicroNAS: Zero-shot neural architecture search for MCUs," arXiv preprint arXiv:2401.08996, 2024.</w:t>
+        <w:t>[13] Y. Qiao, H. Xu, Y. Zhang, and S. Huang, "MicroNAS: Zero-shot neural architecture search for MCUs," in Proc. DATE, 2024.</w:t>
       </w:r>
     </w:p>
     <w:p>
@@ -10673,7 +10673,7 @@
           <w:rFonts w:ascii="Times New Roman" w:hAnsi="Times New Roman"/>
           <w:sz w:val="20"/>
         </w:rPr>
-        <w:t>[16] L. Lai, N. Suda, and V. Chandra, "CMSIS-NN: Efficient neural networks on ARM Cortex-M processors," arXiv preprint arXiv:1801.06601, 2018.</w:t>
+        <w:t>[16] L. Lai, N. Suda, and V. Chandra, "CMSIS-NN: Efficient neural network kernels for Arm Cortex-M CPUs," arXiv preprint arXiv:1801.06601, 2018.</w:t>
       </w:r>
     </w:p>
     <w:p>
@@ -10718,7 +10718,16 @@
           <w:rFonts w:ascii="Times New Roman" w:hAnsi="Times New Roman"/>
           <w:sz w:val="20"/>
         </w:rPr>
-        <w:t>[21] F. Bartoli, L. Boschi, and V. Luise, "End-to-end efficiency in keyword spotting: A system-level approach for embedded microcontrollers," arXiv preprint arXiv:2509.07051, 2025.</w:t>
+        <w:t>[21] P. Bartoli, T. Bondini, C. Veronesi, A. Giudici, N. Antonello, and F. Zappa, "End-to-end efficiency in keyword spotting: A system-level approach for embedded microcontrollers," arXiv preprint arXiv:2509.07051, 2025.</w:t>
+      </w:r>
+    </w:p>
+    <w:p>
+      <w:r>
+        <w:rPr>
+          <w:rFonts w:ascii="Times New Roman" w:hAnsi="Times New Roman"/>
+          <w:sz w:val="20"/>
+        </w:rPr>
+        <w:t>[22] H. Yang et al., "LiCo-Net: Linearized convolution network for hardware-efficient keyword spotting," arXiv preprint arXiv:2211.04635, 2022.</w:t>
       </w:r>
     </w:p>
     <w:sectPr>

</xml_diff>

<commit_message>
revert: undo 3 commits (consistency, narrative, references) back to 68cd2fe
Reverts d61d601, 6f35c98, 03affbe to return to the state after figure insertion.

Co-Authored-By: Claude Opus 4.6 (1M context) <noreply@anthropic.com>
</commit_message>
<xml_diff>
--- a/Optimizing Temporal Efficient Networks for Embedded Keyword Spotting on Microcontrollers.docx
+++ b/Optimizing Temporal Efficient Networks for Embedded Keyword Spotting on Microcontrollers.docx
@@ -30,7 +30,7 @@
           <w:rFonts w:ascii="Times New Roman" w:hAnsi="Times New Roman"/>
           <w:sz w:val="22"/>
         </w:rPr>
-        <w:t xml:space="preserve"> — Keyword spotting (KWS) is a key enabling technology for voice-driven interfaces in embedded and Internet-of-Things (IoT) devices. Deploying deep learning models for KWS directly on microcontrollers is challenging due to strict constraints in memory capacity, computational resources, and energy consumption. In this work, we investigate the optimization of a lightweight neural network architecture for embedded keyword spotting applications. Specifically, we focus on optimizing the Temporal Efficient Network (TENet) architecture through systematic architecture exploration and hyperparameter optimization. Five candidate architectures are evaluated under a computational budget matching a previously reported DS-CNN baseline to enable direct comparison, and TENet is selected as the most efficient base model. A four-stage progressive grid search is then performed over six architectural hyperparameters, evaluating 2,302 candidate configurations. The optimized model is trained using the Google Speech Commands v2 dataset with data augmentation techniques including SpecAugment, Mixup, and label smoothing, and deployed on an STM32F767IGT6 microcontroller based on the ARM Cortex-M7 architecture. Experimental results show that the proposed model achieves a test accuracy of 96.84% (96.76% after INT8 quantization) and a weighted F1-score of 0.9675 with only 12,822 parameters and 276,136 multiply-accumulate operations (MACCs). The deployed INT8 model requires 13.87 KB of flash memory and 7.64 KB of RAM, and achieves an average inference latency of 6.32 ms on the target hardware. Compared with previously reported lightweight keyword spotting architectures operating under similar computational constraints, the optimized TENet model achieves improved classification performance while maintaining a compact footprint suitable for real-time embedded deployment.</w:t>
+        <w:t xml:space="preserve"> — Keyword spotting (KWS) is a key enabling technology for voice-driven interfaces in embedded and Internet-of-Things (IoT) devices. Deploying deep learning models for KWS directly on microcontrollers is challenging due to strict constraints in memory capacity, computational resources, and energy consumption. In this work, we investigate the optimization of a lightweight neural network architecture for embedded keyword spotting applications. Specifically, we focus on improving the Temporal Efficient Network (TENet) architecture through systematic architecture exploration and hyperparameter optimization. Five candidate architectures are evaluated under a fixed computational budget, and TENet is selected as the most efficient base model. A four-stage progressive grid search is then performed over six architectural hyperparameters, evaluating 2,302 candidate configurations. The optimized model is trained using the Google Speech Commands v2 dataset with data augmentation techniques including SpecAugment, Mixup, and label smoothing, and deployed on an STM32F767IGT6 microcontroller based on the ARM Cortex-M7 architecture. Experimental results show that the proposed model achieves a test accuracy of 96.84% (96.76% after INT8 quantization) and a weighted F1-score of 0.9675 with only 12,822 parameters and 276,136 multiply-accumulate operations (MACCs). The deployed INT8 model requires 13.87 KB of flash memory and 7.64 KB of RAM, and achieves an average inference latency of 6.32 ms on the target hardware. Compared with previously reported lightweight keyword spotting architectures operating under similar computational constraints, the optimized TENet model achieves improved classification performance while maintaining a compact footprint suitable for real-time embedded deployment.</w:t>
       </w:r>
     </w:p>
     <w:p>
@@ -123,7 +123,7 @@
           <w:i w:val="0"/>
           <w:sz w:val="22"/>
         </w:rPr>
-        <w:t>Motivated by these challenges, this work investigates the optimization of a lightweight neural architecture for keyword spotting on embedded microcontrollers. Specifically, we focus on the Temporal Efficient Network (TENet) architecture [4] and perform systematic architecture exploration and hyperparameter optimization under a computational budget matching the DS-CNN baseline reported by Sorensen et al. [9], enabling direct comparison on the same MCU platform. The optimized model is trained on the Google Speech Commands v2 dataset [1] and deployed on an STM32F767IGT6 microcontroller based on the ARM Cortex-M7 architecture using the ST X-CUBE-AI framework [8].</w:t>
+        <w:t>Motivated by these challenges, this work investigates the optimization of a lightweight neural architecture for keyword spotting on embedded microcontrollers. Specifically, we focus on the Temporal Efficient Network (TENet) architecture [4] and perform systematic architecture exploration and hyperparameter optimization to improve its performance under a strict computational budget of 287,673 MACCs. The optimized model is trained on the Google Speech Commands v2 dataset [1] and deployed on an STM32F767IGT6 microcontroller based on the ARM Cortex-M7 architecture using the ST X-CUBE-AI framework [8].</w:t>
       </w:r>
     </w:p>
     <w:p>
@@ -146,7 +146,7 @@
           <w:rFonts w:ascii="Times New Roman" w:hAnsi="Times New Roman"/>
           <w:sz w:val="22"/>
         </w:rPr>
-        <w:t>Architecture evaluation for embedded keyword spotting: Five lightweight neural architectures (TENet, LiCoNet, DS-CNN, MobileNet-style, and BC-ResNet) are evaluated under a common computational budget to identify the most efficient model for microcontroller deployment.</w:t>
+        <w:t>Architecture evaluation for embedded keyword spotting: Five lightweight neural architectures (TENet, LiCoNet, DS-CNN, MobileNet-style, and BC-ResNet) are evaluated under a fixed MACC budget to identify the most efficient model for microcontroller deployment.</w:t>
       </w:r>
     </w:p>
     <w:p>
@@ -254,7 +254,7 @@
           <w:i w:val="0"/>
           <w:sz w:val="22"/>
         </w:rPr>
-        <w:t>Kim et al. [5] proposed BC-ResNet, which uses broadcasted residual connections and sub-spectral normalization to achieve state-of-the-art accuracy (up to 98.7% with BC-ResNet-8) on the same benchmark. However, even the smallest variant (BC-ResNet-1, 9.2K parameters) requires 3.1M MACCs, which exceeds the computational budget considered in this work.</w:t>
+        <w:t>Kim et al. [5] proposed BC-ResNet, which uses broadcasted residual connections and sub-spectral normalization to achieve state-of-the-art accuracy (up to 98.7% with BC-ResNet-8) on the same benchmark. However, even the smallest variant (BC-ResNet-1, 9.2K parameters) requires 3.1M MACs, which exceeds the computational budget considered in this work.</w:t>
       </w:r>
     </w:p>
     <w:p>
@@ -268,7 +268,7 @@
           <w:i w:val="0"/>
           <w:sz w:val="22"/>
         </w:rPr>
-        <w:t>Majumdar and Ginsburg [6] developed MatchboxNet using 1D time-channel separable convolutions, achieving 97.48% accuracy with 93K parameters. Yang et al. [22] proposed LiCoNet, which uses linearized convolutions for efficient streaming inference on embedded platforms.</w:t>
+        <w:t>Majumdar and Ginsburg [6] developed MatchboxNet using 1D time-channel separable convolutions, achieving 97.48% accuracy with 93K parameters. LiCoNet uses linearized convolutions for efficient streaming inference on embedded platforms.</w:t>
       </w:r>
     </w:p>
     <w:p>
@@ -304,7 +304,7 @@
           <w:i w:val="0"/>
           <w:sz w:val="22"/>
         </w:rPr>
-        <w:t>For smaller search spaces with a limited number of discrete hyperparameters, grid search and random search remain practical alternatives. Bergstra and Bengio [14] showed that random search can be more efficient than grid search in high-dimensional spaces, while successive halving strategies [15] reduce computational cost by progressively eliminating poor candidates.</w:t>
+        <w:t>For smaller search spaces with a limited number of discrete hyperparameters, grid search and random search remain practical alternatives. Bergstra and Bengio [14] showed that random search can be more efficient than grid search in high-dimensional spaces, while successive halving strategies [15] reduce computational cost by progressively eliminating poor candidates. The progressive grid search approach used in this work combines exhaustive enumeration with staged elimination, which is effective for the six-dimensional search space considered.</w:t>
       </w:r>
     </w:p>
     <w:p>
@@ -370,7 +370,7 @@
           <w:i w:val="0"/>
           <w:sz w:val="22"/>
         </w:rPr>
-        <w:t>The end-to-end keyword spotting pipeline consists of three stages: audio acquisition, feature extraction, and neural network inference. This work focuses on the latter two stages: feature extraction and classification. Audio data is sourced from the Google Speech Commands v2 dataset [1], which provides pre-segmented one-second utterances; real-time audio acquisition and voice activity detection are outside the scope of this work.</w:t>
+        <w:t>The proposed keyword spotting system follows a lightweight processing pipeline designed for deployment on resource-constrained microcontrollers. The system consists of three main stages: audio acquisition, feature extraction, and neural network inference.</w:t>
       </w:r>
     </w:p>
     <w:p>
@@ -384,7 +384,7 @@
           <w:i w:val="0"/>
           <w:sz w:val="22"/>
         </w:rPr>
-        <w:t>Each audio sample (16 kHz, one second) is transformed into MFCC features, which provide a compact representation of the spectral characteristics of speech. These features are used as input to a lightweight neural network classifier that predicts the corresponding keyword class. The overall design minimizes computational complexity and memory usage to enable real-time inference on embedded hardware.</w:t>
+        <w:t>Raw audio waveforms are captured at 16 kHz and segmented into one-second frames. The audio signal is then transformed into MFCC features, which provide a compact representation of the spectral characteristics of speech. These features are used as input to a lightweight neural network classifier that predicts the corresponding keyword class. The overall design minimizes computational complexity and memory usage to enable real-time inference on embedded hardware.</w:t>
       </w:r>
     </w:p>
     <w:p>
@@ -799,7 +799,7 @@
           <w:i w:val="0"/>
           <w:sz w:val="22"/>
         </w:rPr>
-        <w:t>Mel-Frequency Cepstral Coefficient (MFCC) features [7] are extracted from each audio sample using torchaudio. Following standard practice in small-footprint KWS [2][9], 13 MFCC coefficients are used, which capture the dominant spectral envelope characteristics of speech while maintaining a compact input representation.</w:t>
+        <w:t>To convert raw audio signals into a representation suitable for neural network processing, Mel-Frequency Cepstral Coefficient (MFCC) features [7] are extracted from each audio sample using torchaudio.transforms.MFCC.</w:t>
       </w:r>
     </w:p>
     <w:tbl>
@@ -1186,7 +1186,7 @@
           <w:i w:val="0"/>
           <w:sz w:val="22"/>
         </w:rPr>
-        <w:t>With a 512-sample window and 256-sample hop at 16 kHz, each one-second audio clip produces 62 temporal frames. Combined with 13 MFCC coefficients, this yields an input tensor of shape (1, 62, 13) with a size of 3,224 bytes in float32 precision. The number of mel filters (16) was chosen to balance spectral resolution with computational cost for the target MCU.</w:t>
+        <w:t>These parameters produce an MFCC feature representation of 62 temporal frames × 13 coefficients per sample, resulting in an input tensor of shape (1, 62, 13) with a size of 3,224 bytes in float32 precision.</w:t>
       </w:r>
     </w:p>
     <w:p>
@@ -1208,7 +1208,7 @@
           <w:i w:val="0"/>
           <w:sz w:val="22"/>
         </w:rPr>
-        <w:t>To identify the most efficient architecture under the target computational budget (matching the DS-CNN baseline [9]), five lightweight neural network architectures were evaluated. All models were configured to operate within approximately 287K MACCs and trained for 50 epochs with identical settings (AdamW, lr=0.001, batch size=1024) on the 12-class task.</w:t>
+        <w:t>To identify the most efficient architecture for the target computational budget, five lightweight neural network architectures were evaluated under a constraint of approximately 287K MACCs. All models were trained for 50 epochs with identical training settings (AdamW, lr=0.001, batch size=1024) on the 12-class task.</w:t>
       </w:r>
     </w:p>
     <w:p>
@@ -1969,7 +1969,7 @@
           <w:i w:val="0"/>
           <w:sz w:val="22"/>
         </w:rPr>
-        <w:t>Based on the architecture comparison in Section III.D, TENet [4] was selected as the base architecture for further optimization. TENet processes MFCC sequences using one-dimensional temporal convolutions. The input tensor (1, 62, 13) is reshaped to (13, 62), treating the 13 MFCC coefficients as input channels and the 62 frames as the temporal dimension.</w:t>
+        <w:t>The TENet architecture [4] processes MFCC sequences using one-dimensional temporal convolutions. The input tensor (1, 62, 13) is reshaped to (13, 62), treating the 13 MFCC coefficients as input channels and the 62 frames as the temporal dimension.</w:t>
       </w:r>
     </w:p>
     <w:p>
@@ -1983,7 +1983,7 @@
           <w:i w:val="0"/>
           <w:sz w:val="22"/>
         </w:rPr>
-        <w:t>The TENet block adopts the inverted bottleneck design from MobileNetV2 [10], adapted for 1D temporal processing. Each block consists of: (1) pointwise expansion Conv1d (in_ch → in_ch × ratio, kernel=1); (2) depthwise temporal Conv1d (groups=hidden, kernel=k); (3) pointwise projection Conv1d (hidden → out_ch, kernel=1) with linear activation; and (4) a residual connection. This is a standard building block; our contribution lies not in the block design but in the specific configuration discovered through systematic search (Section III.F).</w:t>
+        <w:t>The architecture adopts an inverted bottleneck design inspired by MobileNetV2 [10], where each block consists of: (1) pointwise expansion Conv1d (in_ch → in_ch × ratio, kernel=1) to increase channel dimension; (2) depthwise temporal Conv1d (hidden, hidden, kernel=k, groups=hidden) for temporal feature extraction; (3) pointwise projection Conv1d (hidden → out_ch, kernel=1) for dimensionality reduction with no activation (linear); and (4) a residual connection (identity shortcut when stride=1 and in_ch=out_ch, otherwise a 1×1 projection shortcut).</w:t>
       </w:r>
     </w:p>
     <w:p>
@@ -2433,7 +2433,7 @@
           <w:i w:val="0"/>
           <w:sz w:val="22"/>
         </w:rPr>
-        <w:t>Three key findings from the grid search distinguish the optimized configuration from typical TENet designs:</w:t>
+        <w:t>Three key architectural design choices distinguish this configuration:</w:t>
       </w:r>
     </w:p>
     <w:p>
@@ -2541,7 +2541,7 @@
           <w:i w:val="0"/>
           <w:sz w:val="22"/>
         </w:rPr>
-        <w:t>After selecting TENet as the base architecture, a four-stage progressive grid search was conducted to identify improved architectural configurations. The computational budget was set to match the DS-CNN baseline reported by Sorensen et al. [9] (287,673 MACCs), enabling direct comparison on the same MCU platform under identical resource constraints. The search space comprises six discrete architectural hyperparameters with fewer than 3,000 feasible configurations under the MACC constraint. For a space of this scale, exhaustive evaluation with progressive filtering is computationally tractable (~16 GPU-hours on a single GPU) and avoids the approximation errors inherent in weight-sharing NAS methods [12]. The progressive filtering strategy is conceptually related to successive halving [15].</w:t>
+        <w:t>After selecting TENet as the base architecture, a four-stage progressive grid search was conducted to identify improved architectural configurations within the MACC budget of 287,673 (matching the DS-CNN baseline [9]).</w:t>
       </w:r>
     </w:p>
     <w:p>
@@ -3743,7 +3743,7 @@
           <w:i w:val="0"/>
           <w:sz w:val="22"/>
         </w:rPr>
-        <w:t>All experiments were conducted on an NVIDIA RTX 5080 Laptop GPU with data preloaded to GPU VRAM for efficient small-model training.</w:t>
+        <w:t>All experiments were conducted on an NVIDIA RTX 5080 Laptop GPU with data preloaded to GPU VRAM for efficient small-model training. The progressive search strategy is conceptually related to successive halving [15], where computational resources are concentrated on the most promising candidates in later stages.</w:t>
       </w:r>
     </w:p>
     <w:p>
@@ -4388,7 +4388,7 @@
           <w:rFonts w:ascii="Times New Roman" w:hAnsi="Times New Roman"/>
           <w:sz w:val="20"/>
         </w:rPr>
-        <w:t>Fig. 4. Training curve showing validation accuracy and cosine annealing learning rate schedule over 273 epochs.</w:t>
+        <w:t>Fig. 5. Training curve showing validation accuracy and cosine annealing learning rate schedule over 273 epochs.</w:t>
       </w:r>
     </w:p>
     <w:p>
@@ -5799,7 +5799,7 @@
           <w:rFonts w:ascii="Times New Roman" w:hAnsi="Times New Roman"/>
           <w:sz w:val="20"/>
         </w:rPr>
-        <w:t>Fig. 5. Per-class F1-scores comparing float32 and INT8 models across all 12 classes.</w:t>
+        <w:t>Fig. 4. Per-class F1-scores comparing Float32 and INT8 models across all 12 classes.</w:t>
       </w:r>
     </w:p>
     <w:p>
@@ -10465,7 +10465,7 @@
           <w:i w:val="0"/>
           <w:sz w:val="22"/>
         </w:rPr>
-        <w:t>This paper presented an optimized keyword spotting system designed for deployment on resource-constrained microcontrollers. Through a five-architecture comparison study and a four-stage progressive grid search over 2,302 candidate configurations, an optimized TENet variant was identified that achieves high classification accuracy within a computational budget of 276K MACCs.</w:t>
+        <w:t>This paper presented an optimized keyword spotting system designed for deployment on resource-constrained microcontrollers. Through a five-architecture comparison study and a four-stage progressive grid search over 2,302 candidate configurations, an optimized TENet variant was identified that achieves high classification accuracy within a strict computational budget of 276K MACCs.</w:t>
       </w:r>
     </w:p>
     <w:p>
@@ -10565,7 +10565,7 @@
           <w:rFonts w:ascii="Times New Roman" w:hAnsi="Times New Roman"/>
           <w:sz w:val="20"/>
         </w:rPr>
-        <w:t>[4] X. Li, X. Wei, and X. Qin, "Small-footprint keyword spotting with multi-scale temporal convolution," in Proc. Interspeech, 2020, pp. 1987–1991.</w:t>
+        <w:t>[4] R. Li, Z. Gao, L. Wang, and G. Li, "Small-footprint keyword spotting with multi-scale temporal convolution," in Proc. Interspeech, 2020.</w:t>
       </w:r>
     </w:p>
     <w:p>
@@ -10646,7 +10646,7 @@
           <w:rFonts w:ascii="Times New Roman" w:hAnsi="Times New Roman"/>
           <w:sz w:val="20"/>
         </w:rPr>
-        <w:t>[13] Y. Qiao, H. Xu, Y. Zhang, and S. Huang, "MicroNAS: Zero-shot neural architecture search for MCUs," in Proc. DATE, 2024.</w:t>
+        <w:t>[13] S. Liberatore, F. Pollicino, and M. Rusci, "MicroNAS: Zero-shot neural architecture search for MCUs," arXiv preprint arXiv:2401.08996, 2024.</w:t>
       </w:r>
     </w:p>
     <w:p>
@@ -10673,7 +10673,7 @@
           <w:rFonts w:ascii="Times New Roman" w:hAnsi="Times New Roman"/>
           <w:sz w:val="20"/>
         </w:rPr>
-        <w:t>[16] L. Lai, N. Suda, and V. Chandra, "CMSIS-NN: Efficient neural network kernels for Arm Cortex-M CPUs," arXiv preprint arXiv:1801.06601, 2018.</w:t>
+        <w:t>[16] L. Lai, N. Suda, and V. Chandra, "CMSIS-NN: Efficient neural networks on ARM Cortex-M processors," arXiv preprint arXiv:1801.06601, 2018.</w:t>
       </w:r>
     </w:p>
     <w:p>
@@ -10718,16 +10718,7 @@
           <w:rFonts w:ascii="Times New Roman" w:hAnsi="Times New Roman"/>
           <w:sz w:val="20"/>
         </w:rPr>
-        <w:t>[21] P. Bartoli, T. Bondini, C. Veronesi, A. Giudici, N. Antonello, and F. Zappa, "End-to-end efficiency in keyword spotting: A system-level approach for embedded microcontrollers," arXiv preprint arXiv:2509.07051, 2025.</w:t>
-      </w:r>
-    </w:p>
-    <w:p>
-      <w:r>
-        <w:rPr>
-          <w:rFonts w:ascii="Times New Roman" w:hAnsi="Times New Roman"/>
-          <w:sz w:val="20"/>
-        </w:rPr>
-        <w:t>[22] H. Yang et al., "LiCo-Net: Linearized convolution network for hardware-efficient keyword spotting," arXiv preprint arXiv:2211.04635, 2022.</w:t>
+        <w:t>[21] F. Bartoli, L. Boschi, and V. Luise, "End-to-end efficiency in keyword spotting: A system-level approach for embedded microcontrollers," arXiv preprint arXiv:2509.07051, 2025.</w:t>
       </w:r>
     </w:p>
     <w:sectPr>

</xml_diff>